<commit_message>
Stellen-/Rollenbeschreibungen: Verweis auf Verfahrensanweisung 7V-5-1 entfernt
Alexander: eine Stellenbeschreibung ist kein Prozessdokument und muss nicht
auf ihr Verhältnis zur Verfahrensanweisung 7V-5-1 verweisen. Betrifft alle
fünf Dokumente (Produktionskoordination, QS, PQB je Stellen-/
Rollenbeschreibung). Untertitel jetzt nur noch "Arbeitsentwurf." bzw.
"Arbeitsentwurf zum Ausdrucken" ohne jede Status-/Prozessnotiz.

Co-Authored-By: Claude Sonnet 5 <noreply@anthropic.com>
Claude-Session: https://claude.ai/code/session_01DYu9Jmx4EF5jDapuJDs8ut
</commit_message>
<xml_diff>
--- a/working/PQB_Rollenbeschreibung_Arbeitsentwurf.docx
+++ b/working/PQB_Rollenbeschreibung_Arbeitsentwurf.docx
@@ -16,7 +16,7 @@
     </w:p>
     <w:p>
       <w:pPr>
-        <w:spacing w:after="100"/>
+        <w:spacing w:after="200"/>
       </w:pPr>
       <w:r>
         <w:rPr>
@@ -27,21 +27,6 @@
           <w:szCs w:val="20"/>
         </w:rPr>
         <w:t xml:space="preserve">Arbeitsentwurf zum Ausdrucken</w:t>
-      </w:r>
-    </w:p>
-    <w:p>
-      <w:pPr>
-        <w:spacing w:after="200"/>
-      </w:pPr>
-      <w:r>
-        <w:rPr>
-          <w:rFonts w:ascii="Calibri" w:cs="Calibri" w:eastAsia="Calibri" w:hAnsi="Calibri"/>
-          <w:i/>
-          <w:iCs/>
-          <w:sz w:val="18"/>
-          <w:szCs w:val="18"/>
-        </w:rPr>
-        <w:t xml:space="preserve">Noch nicht Teil der Verfahrensanweisung 7V-5-1.</w:t>
       </w:r>
     </w:p>
     <w:p>

</xml_diff>